<commit_message>
Regenerate report with MariaDB 12.2 VU sweep data
Adds 6 new iterations at BP=110 GiB for VU=10/20/40/80/160/320.
runs.json now covers 56 iterations. Rebuilt fig3/fig4/fig7 (VU-axis
charts), REPORT.md/docx, and the Google Docs HTML.

Co-Authored-By: Claude Opus 4.7 (1M context) <noreply@anthropic.com>
</commit_message>
<xml_diff>
--- a/REPORT.docx
+++ b/REPORT.docx
@@ -46,7 +46,7 @@
           <w:b/>
           <w:sz w:val="20"/>
         </w:rPr>
-        <w:t>Engines: MariaDB 12.2.2, MariaDB 12.3.1-rc, MySQL 8.4.8, MySQL 9.7.0  ·  Generated: 2026-04-24</w:t>
+        <w:t>Engines: MariaDB 12.2.2, MariaDB 12.3.1-rc, MySQL 8.4.8, MySQL 9.7.0  ·  Generated: 2026-04-27</w:t>
       </w:r>
     </w:p>
     <w:p>
@@ -246,7 +246,7 @@
               <w:rPr>
                 <w:sz w:val="18"/>
               </w:rPr>
-              <w:t>1,147,448</w:t>
+              <w:t>1,226,157</w:t>
             </w:r>
           </w:p>
         </w:tc>
@@ -313,7 +313,7 @@
               <w:rPr>
                 <w:sz w:val="18"/>
               </w:rPr>
-              <w:t>—</w:t>
+              <w:t>3.9×</w:t>
             </w:r>
           </w:p>
         </w:tc>
@@ -1193,7 +1193,7 @@
               <w:rPr>
                 <w:sz w:val="18"/>
               </w:rPr>
-              <w:t>—</w:t>
+              <w:t>301,942</w:t>
             </w:r>
           </w:p>
         </w:tc>
@@ -1262,7 +1262,7 @@
               <w:rPr>
                 <w:sz w:val="18"/>
               </w:rPr>
-              <w:t>—</w:t>
+              <w:t>541,276</w:t>
             </w:r>
           </w:p>
         </w:tc>
@@ -1331,7 +1331,7 @@
               <w:rPr>
                 <w:sz w:val="18"/>
               </w:rPr>
-              <w:t>—</w:t>
+              <w:t>848,592</w:t>
             </w:r>
           </w:p>
         </w:tc>
@@ -1400,7 +1400,7 @@
               <w:rPr>
                 <w:sz w:val="18"/>
               </w:rPr>
-              <w:t>1,147,448</w:t>
+              <w:t>1,157,551</w:t>
             </w:r>
           </w:p>
         </w:tc>
@@ -1469,7 +1469,7 @@
               <w:rPr>
                 <w:sz w:val="18"/>
               </w:rPr>
-              <w:t>—</w:t>
+              <w:t>1,226,157</w:t>
             </w:r>
           </w:p>
         </w:tc>
@@ -1538,7 +1538,7 @@
               <w:rPr>
                 <w:sz w:val="18"/>
               </w:rPr>
-              <w:t>—</w:t>
+              <w:t>1,186,987</w:t>
             </w:r>
           </w:p>
         </w:tc>
@@ -4645,85 +4645,85 @@
               <w:rPr>
                 <w:sz w:val="18"/>
               </w:rPr>
-              <w:t>MariaDB 12.3.1</w:t>
-            </w:r>
-          </w:p>
-        </w:tc>
-        <w:tc>
-          <w:tcPr>
-            <w:tcW w:type="dxa" w:w="1080"/>
-          </w:tcPr>
-          <w:p>
-            <w:r>
-              <w:rPr>
-                <w:sz w:val="18"/>
-              </w:rPr>
-              <w:t>292,824</w:t>
-            </w:r>
-          </w:p>
-        </w:tc>
-        <w:tc>
-          <w:tcPr>
-            <w:tcW w:type="dxa" w:w="1080"/>
-          </w:tcPr>
-          <w:p>
-            <w:r>
-              <w:rPr>
-                <w:sz w:val="18"/>
-              </w:rPr>
-              <w:t>16,691</w:t>
-            </w:r>
-          </w:p>
-        </w:tc>
-        <w:tc>
-          <w:tcPr>
-            <w:tcW w:type="dxa" w:w="1080"/>
-          </w:tcPr>
-          <w:p>
-            <w:r>
-              <w:rPr>
-                <w:sz w:val="18"/>
-              </w:rPr>
-              <w:t>5.7%</w:t>
-            </w:r>
-          </w:p>
-        </w:tc>
-        <w:tc>
-          <w:tcPr>
-            <w:tcW w:type="dxa" w:w="1080"/>
-          </w:tcPr>
-          <w:p>
-            <w:r>
-              <w:rPr>
-                <w:sz w:val="18"/>
-              </w:rPr>
-              <w:t>267,300</w:t>
-            </w:r>
-          </w:p>
-        </w:tc>
-        <w:tc>
-          <w:tcPr>
-            <w:tcW w:type="dxa" w:w="1080"/>
-          </w:tcPr>
-          <w:p>
-            <w:r>
-              <w:rPr>
-                <w:sz w:val="18"/>
-              </w:rPr>
-              <w:t>311,700</w:t>
-            </w:r>
-          </w:p>
-        </w:tc>
-        <w:tc>
-          <w:tcPr>
-            <w:tcW w:type="dxa" w:w="1080"/>
-          </w:tcPr>
-          <w:p>
-            <w:r>
-              <w:rPr>
-                <w:sz w:val="18"/>
-              </w:rPr>
-              <w:t>44,400</w:t>
+              <w:t>MariaDB 12.2.2</w:t>
+            </w:r>
+          </w:p>
+        </w:tc>
+        <w:tc>
+          <w:tcPr>
+            <w:tcW w:type="dxa" w:w="1080"/>
+          </w:tcPr>
+          <w:p>
+            <w:r>
+              <w:rPr>
+                <w:sz w:val="18"/>
+              </w:rPr>
+              <w:t>302,186</w:t>
+            </w:r>
+          </w:p>
+        </w:tc>
+        <w:tc>
+          <w:tcPr>
+            <w:tcW w:type="dxa" w:w="1080"/>
+          </w:tcPr>
+          <w:p>
+            <w:r>
+              <w:rPr>
+                <w:sz w:val="18"/>
+              </w:rPr>
+              <w:t>13,847</w:t>
+            </w:r>
+          </w:p>
+        </w:tc>
+        <w:tc>
+          <w:tcPr>
+            <w:tcW w:type="dxa" w:w="1080"/>
+          </w:tcPr>
+          <w:p>
+            <w:r>
+              <w:rPr>
+                <w:sz w:val="18"/>
+              </w:rPr>
+              <w:t>4.6%</w:t>
+            </w:r>
+          </w:p>
+        </w:tc>
+        <w:tc>
+          <w:tcPr>
+            <w:tcW w:type="dxa" w:w="1080"/>
+          </w:tcPr>
+          <w:p>
+            <w:r>
+              <w:rPr>
+                <w:sz w:val="18"/>
+              </w:rPr>
+              <w:t>279,120</w:t>
+            </w:r>
+          </w:p>
+        </w:tc>
+        <w:tc>
+          <w:tcPr>
+            <w:tcW w:type="dxa" w:w="1080"/>
+          </w:tcPr>
+          <w:p>
+            <w:r>
+              <w:rPr>
+                <w:sz w:val="18"/>
+              </w:rPr>
+              <w:t>318,300</w:t>
+            </w:r>
+          </w:p>
+        </w:tc>
+        <w:tc>
+          <w:tcPr>
+            <w:tcW w:type="dxa" w:w="1080"/>
+          </w:tcPr>
+          <w:p>
+            <w:r>
+              <w:rPr>
+                <w:sz w:val="18"/>
+              </w:rPr>
+              <w:t>39,180</w:t>
             </w:r>
           </w:p>
         </w:tc>
@@ -4751,85 +4751,85 @@
               <w:rPr>
                 <w:sz w:val="18"/>
               </w:rPr>
-              <w:t>MySQL 8.4.8</w:t>
-            </w:r>
-          </w:p>
-        </w:tc>
-        <w:tc>
-          <w:tcPr>
-            <w:tcW w:type="dxa" w:w="1080"/>
-          </w:tcPr>
-          <w:p>
-            <w:r>
-              <w:rPr>
-                <w:sz w:val="18"/>
-              </w:rPr>
-              <w:t>276,348</w:t>
-            </w:r>
-          </w:p>
-        </w:tc>
-        <w:tc>
-          <w:tcPr>
-            <w:tcW w:type="dxa" w:w="1080"/>
-          </w:tcPr>
-          <w:p>
-            <w:r>
-              <w:rPr>
-                <w:sz w:val="18"/>
-              </w:rPr>
-              <w:t>8,857</w:t>
-            </w:r>
-          </w:p>
-        </w:tc>
-        <w:tc>
-          <w:tcPr>
-            <w:tcW w:type="dxa" w:w="1080"/>
-          </w:tcPr>
-          <w:p>
-            <w:r>
-              <w:rPr>
-                <w:sz w:val="18"/>
-              </w:rPr>
-              <w:t>3.2%</w:t>
-            </w:r>
-          </w:p>
-        </w:tc>
-        <w:tc>
-          <w:tcPr>
-            <w:tcW w:type="dxa" w:w="1080"/>
-          </w:tcPr>
-          <w:p>
-            <w:r>
-              <w:rPr>
-                <w:sz w:val="18"/>
-              </w:rPr>
-              <w:t>264,360</w:t>
-            </w:r>
-          </w:p>
-        </w:tc>
-        <w:tc>
-          <w:tcPr>
-            <w:tcW w:type="dxa" w:w="1080"/>
-          </w:tcPr>
-          <w:p>
-            <w:r>
-              <w:rPr>
-                <w:sz w:val="18"/>
-              </w:rPr>
-              <w:t>287,520</w:t>
-            </w:r>
-          </w:p>
-        </w:tc>
-        <w:tc>
-          <w:tcPr>
-            <w:tcW w:type="dxa" w:w="1080"/>
-          </w:tcPr>
-          <w:p>
-            <w:r>
-              <w:rPr>
-                <w:sz w:val="18"/>
-              </w:rPr>
-              <w:t>23,160</w:t>
+              <w:t>MariaDB 12.3.1</w:t>
+            </w:r>
+          </w:p>
+        </w:tc>
+        <w:tc>
+          <w:tcPr>
+            <w:tcW w:type="dxa" w:w="1080"/>
+          </w:tcPr>
+          <w:p>
+            <w:r>
+              <w:rPr>
+                <w:sz w:val="18"/>
+              </w:rPr>
+              <w:t>292,824</w:t>
+            </w:r>
+          </w:p>
+        </w:tc>
+        <w:tc>
+          <w:tcPr>
+            <w:tcW w:type="dxa" w:w="1080"/>
+          </w:tcPr>
+          <w:p>
+            <w:r>
+              <w:rPr>
+                <w:sz w:val="18"/>
+              </w:rPr>
+              <w:t>16,691</w:t>
+            </w:r>
+          </w:p>
+        </w:tc>
+        <w:tc>
+          <w:tcPr>
+            <w:tcW w:type="dxa" w:w="1080"/>
+          </w:tcPr>
+          <w:p>
+            <w:r>
+              <w:rPr>
+                <w:sz w:val="18"/>
+              </w:rPr>
+              <w:t>5.7%</w:t>
+            </w:r>
+          </w:p>
+        </w:tc>
+        <w:tc>
+          <w:tcPr>
+            <w:tcW w:type="dxa" w:w="1080"/>
+          </w:tcPr>
+          <w:p>
+            <w:r>
+              <w:rPr>
+                <w:sz w:val="18"/>
+              </w:rPr>
+              <w:t>267,300</w:t>
+            </w:r>
+          </w:p>
+        </w:tc>
+        <w:tc>
+          <w:tcPr>
+            <w:tcW w:type="dxa" w:w="1080"/>
+          </w:tcPr>
+          <w:p>
+            <w:r>
+              <w:rPr>
+                <w:sz w:val="18"/>
+              </w:rPr>
+              <w:t>311,700</w:t>
+            </w:r>
+          </w:p>
+        </w:tc>
+        <w:tc>
+          <w:tcPr>
+            <w:tcW w:type="dxa" w:w="1080"/>
+          </w:tcPr>
+          <w:p>
+            <w:r>
+              <w:rPr>
+                <w:sz w:val="18"/>
+              </w:rPr>
+              <w:t>44,400</w:t>
             </w:r>
           </w:p>
         </w:tc>
@@ -4857,85 +4857,85 @@
               <w:rPr>
                 <w:sz w:val="18"/>
               </w:rPr>
-              <w:t>MySQL 9.7.0</w:t>
-            </w:r>
-          </w:p>
-        </w:tc>
-        <w:tc>
-          <w:tcPr>
-            <w:tcW w:type="dxa" w:w="1080"/>
-          </w:tcPr>
-          <w:p>
-            <w:r>
-              <w:rPr>
-                <w:sz w:val="18"/>
-              </w:rPr>
-              <w:t>333,440</w:t>
-            </w:r>
-          </w:p>
-        </w:tc>
-        <w:tc>
-          <w:tcPr>
-            <w:tcW w:type="dxa" w:w="1080"/>
-          </w:tcPr>
-          <w:p>
-            <w:r>
-              <w:rPr>
-                <w:sz w:val="18"/>
-              </w:rPr>
-              <w:t>12,863</w:t>
-            </w:r>
-          </w:p>
-        </w:tc>
-        <w:tc>
-          <w:tcPr>
-            <w:tcW w:type="dxa" w:w="1080"/>
-          </w:tcPr>
-          <w:p>
-            <w:r>
-              <w:rPr>
-                <w:sz w:val="18"/>
-              </w:rPr>
-              <w:t>3.9%</w:t>
-            </w:r>
-          </w:p>
-        </w:tc>
-        <w:tc>
-          <w:tcPr>
-            <w:tcW w:type="dxa" w:w="1080"/>
-          </w:tcPr>
-          <w:p>
-            <w:r>
-              <w:rPr>
-                <w:sz w:val="18"/>
-              </w:rPr>
-              <w:t>310,560</w:t>
-            </w:r>
-          </w:p>
-        </w:tc>
-        <w:tc>
-          <w:tcPr>
-            <w:tcW w:type="dxa" w:w="1080"/>
-          </w:tcPr>
-          <w:p>
-            <w:r>
-              <w:rPr>
-                <w:sz w:val="18"/>
-              </w:rPr>
-              <w:t>350,580</w:t>
-            </w:r>
-          </w:p>
-        </w:tc>
-        <w:tc>
-          <w:tcPr>
-            <w:tcW w:type="dxa" w:w="1080"/>
-          </w:tcPr>
-          <w:p>
-            <w:r>
-              <w:rPr>
-                <w:sz w:val="18"/>
-              </w:rPr>
-              <w:t>40,020</w:t>
+              <w:t>MySQL 8.4.8</w:t>
+            </w:r>
+          </w:p>
+        </w:tc>
+        <w:tc>
+          <w:tcPr>
+            <w:tcW w:type="dxa" w:w="1080"/>
+          </w:tcPr>
+          <w:p>
+            <w:r>
+              <w:rPr>
+                <w:sz w:val="18"/>
+              </w:rPr>
+              <w:t>276,348</w:t>
+            </w:r>
+          </w:p>
+        </w:tc>
+        <w:tc>
+          <w:tcPr>
+            <w:tcW w:type="dxa" w:w="1080"/>
+          </w:tcPr>
+          <w:p>
+            <w:r>
+              <w:rPr>
+                <w:sz w:val="18"/>
+              </w:rPr>
+              <w:t>8,857</w:t>
+            </w:r>
+          </w:p>
+        </w:tc>
+        <w:tc>
+          <w:tcPr>
+            <w:tcW w:type="dxa" w:w="1080"/>
+          </w:tcPr>
+          <w:p>
+            <w:r>
+              <w:rPr>
+                <w:sz w:val="18"/>
+              </w:rPr>
+              <w:t>3.2%</w:t>
+            </w:r>
+          </w:p>
+        </w:tc>
+        <w:tc>
+          <w:tcPr>
+            <w:tcW w:type="dxa" w:w="1080"/>
+          </w:tcPr>
+          <w:p>
+            <w:r>
+              <w:rPr>
+                <w:sz w:val="18"/>
+              </w:rPr>
+              <w:t>264,360</w:t>
+            </w:r>
+          </w:p>
+        </w:tc>
+        <w:tc>
+          <w:tcPr>
+            <w:tcW w:type="dxa" w:w="1080"/>
+          </w:tcPr>
+          <w:p>
+            <w:r>
+              <w:rPr>
+                <w:sz w:val="18"/>
+              </w:rPr>
+              <w:t>287,520</w:t>
+            </w:r>
+          </w:p>
+        </w:tc>
+        <w:tc>
+          <w:tcPr>
+            <w:tcW w:type="dxa" w:w="1080"/>
+          </w:tcPr>
+          <w:p>
+            <w:r>
+              <w:rPr>
+                <w:sz w:val="18"/>
+              </w:rPr>
+              <w:t>23,160</w:t>
             </w:r>
           </w:p>
         </w:tc>
@@ -4950,98 +4950,98 @@
               <w:rPr>
                 <w:sz w:val="18"/>
               </w:rPr>
-              <w:t>20 VU</w:t>
-            </w:r>
-          </w:p>
-        </w:tc>
-        <w:tc>
-          <w:tcPr>
-            <w:tcW w:type="dxa" w:w="1080"/>
-          </w:tcPr>
-          <w:p>
-            <w:r>
-              <w:rPr>
-                <w:sz w:val="18"/>
-              </w:rPr>
-              <w:t>MariaDB 12.3.1</w:t>
-            </w:r>
-          </w:p>
-        </w:tc>
-        <w:tc>
-          <w:tcPr>
-            <w:tcW w:type="dxa" w:w="1080"/>
-          </w:tcPr>
-          <w:p>
-            <w:r>
-              <w:rPr>
-                <w:sz w:val="18"/>
-              </w:rPr>
-              <w:t>519,306</w:t>
-            </w:r>
-          </w:p>
-        </w:tc>
-        <w:tc>
-          <w:tcPr>
-            <w:tcW w:type="dxa" w:w="1080"/>
-          </w:tcPr>
-          <w:p>
-            <w:r>
-              <w:rPr>
-                <w:sz w:val="18"/>
-              </w:rPr>
-              <w:t>29,548</w:t>
-            </w:r>
-          </w:p>
-        </w:tc>
-        <w:tc>
-          <w:tcPr>
-            <w:tcW w:type="dxa" w:w="1080"/>
-          </w:tcPr>
-          <w:p>
-            <w:r>
-              <w:rPr>
-                <w:sz w:val="18"/>
-              </w:rPr>
-              <w:t>5.7%</w:t>
-            </w:r>
-          </w:p>
-        </w:tc>
-        <w:tc>
-          <w:tcPr>
-            <w:tcW w:type="dxa" w:w="1080"/>
-          </w:tcPr>
-          <w:p>
-            <w:r>
-              <w:rPr>
-                <w:sz w:val="18"/>
-              </w:rPr>
-              <w:t>473,040</w:t>
-            </w:r>
-          </w:p>
-        </w:tc>
-        <w:tc>
-          <w:tcPr>
-            <w:tcW w:type="dxa" w:w="1080"/>
-          </w:tcPr>
-          <w:p>
-            <w:r>
-              <w:rPr>
-                <w:sz w:val="18"/>
-              </w:rPr>
-              <w:t>566,760</w:t>
-            </w:r>
-          </w:p>
-        </w:tc>
-        <w:tc>
-          <w:tcPr>
-            <w:tcW w:type="dxa" w:w="1080"/>
-          </w:tcPr>
-          <w:p>
-            <w:r>
-              <w:rPr>
-                <w:sz w:val="18"/>
-              </w:rPr>
-              <w:t>93,720</w:t>
+              <w:t>10 VU</w:t>
+            </w:r>
+          </w:p>
+        </w:tc>
+        <w:tc>
+          <w:tcPr>
+            <w:tcW w:type="dxa" w:w="1080"/>
+          </w:tcPr>
+          <w:p>
+            <w:r>
+              <w:rPr>
+                <w:sz w:val="18"/>
+              </w:rPr>
+              <w:t>MySQL 9.7.0</w:t>
+            </w:r>
+          </w:p>
+        </w:tc>
+        <w:tc>
+          <w:tcPr>
+            <w:tcW w:type="dxa" w:w="1080"/>
+          </w:tcPr>
+          <w:p>
+            <w:r>
+              <w:rPr>
+                <w:sz w:val="18"/>
+              </w:rPr>
+              <w:t>333,440</w:t>
+            </w:r>
+          </w:p>
+        </w:tc>
+        <w:tc>
+          <w:tcPr>
+            <w:tcW w:type="dxa" w:w="1080"/>
+          </w:tcPr>
+          <w:p>
+            <w:r>
+              <w:rPr>
+                <w:sz w:val="18"/>
+              </w:rPr>
+              <w:t>12,863</w:t>
+            </w:r>
+          </w:p>
+        </w:tc>
+        <w:tc>
+          <w:tcPr>
+            <w:tcW w:type="dxa" w:w="1080"/>
+          </w:tcPr>
+          <w:p>
+            <w:r>
+              <w:rPr>
+                <w:sz w:val="18"/>
+              </w:rPr>
+              <w:t>3.9%</w:t>
+            </w:r>
+          </w:p>
+        </w:tc>
+        <w:tc>
+          <w:tcPr>
+            <w:tcW w:type="dxa" w:w="1080"/>
+          </w:tcPr>
+          <w:p>
+            <w:r>
+              <w:rPr>
+                <w:sz w:val="18"/>
+              </w:rPr>
+              <w:t>310,560</w:t>
+            </w:r>
+          </w:p>
+        </w:tc>
+        <w:tc>
+          <w:tcPr>
+            <w:tcW w:type="dxa" w:w="1080"/>
+          </w:tcPr>
+          <w:p>
+            <w:r>
+              <w:rPr>
+                <w:sz w:val="18"/>
+              </w:rPr>
+              <w:t>350,580</w:t>
+            </w:r>
+          </w:p>
+        </w:tc>
+        <w:tc>
+          <w:tcPr>
+            <w:tcW w:type="dxa" w:w="1080"/>
+          </w:tcPr>
+          <w:p>
+            <w:r>
+              <w:rPr>
+                <w:sz w:val="18"/>
+              </w:rPr>
+              <w:t>40,020</w:t>
             </w:r>
           </w:p>
         </w:tc>
@@ -5069,85 +5069,85 @@
               <w:rPr>
                 <w:sz w:val="18"/>
               </w:rPr>
-              <w:t>MySQL 8.4.8</w:t>
-            </w:r>
-          </w:p>
-        </w:tc>
-        <w:tc>
-          <w:tcPr>
-            <w:tcW w:type="dxa" w:w="1080"/>
-          </w:tcPr>
-          <w:p>
-            <w:r>
-              <w:rPr>
-                <w:sz w:val="18"/>
-              </w:rPr>
-              <w:t>506,616</w:t>
-            </w:r>
-          </w:p>
-        </w:tc>
-        <w:tc>
-          <w:tcPr>
-            <w:tcW w:type="dxa" w:w="1080"/>
-          </w:tcPr>
-          <w:p>
-            <w:r>
-              <w:rPr>
-                <w:sz w:val="18"/>
-              </w:rPr>
-              <w:t>19,442</w:t>
-            </w:r>
-          </w:p>
-        </w:tc>
-        <w:tc>
-          <w:tcPr>
-            <w:tcW w:type="dxa" w:w="1080"/>
-          </w:tcPr>
-          <w:p>
-            <w:r>
-              <w:rPr>
-                <w:sz w:val="18"/>
-              </w:rPr>
-              <w:t>3.8%</w:t>
-            </w:r>
-          </w:p>
-        </w:tc>
-        <w:tc>
-          <w:tcPr>
-            <w:tcW w:type="dxa" w:w="1080"/>
-          </w:tcPr>
-          <w:p>
-            <w:r>
-              <w:rPr>
-                <w:sz w:val="18"/>
-              </w:rPr>
-              <w:t>471,540</w:t>
-            </w:r>
-          </w:p>
-        </w:tc>
-        <w:tc>
-          <w:tcPr>
-            <w:tcW w:type="dxa" w:w="1080"/>
-          </w:tcPr>
-          <w:p>
-            <w:r>
-              <w:rPr>
-                <w:sz w:val="18"/>
-              </w:rPr>
-              <w:t>528,660</w:t>
-            </w:r>
-          </w:p>
-        </w:tc>
-        <w:tc>
-          <w:tcPr>
-            <w:tcW w:type="dxa" w:w="1080"/>
-          </w:tcPr>
-          <w:p>
-            <w:r>
-              <w:rPr>
-                <w:sz w:val="18"/>
-              </w:rPr>
-              <w:t>57,120</w:t>
+              <w:t>MariaDB 12.2.2</w:t>
+            </w:r>
+          </w:p>
+        </w:tc>
+        <w:tc>
+          <w:tcPr>
+            <w:tcW w:type="dxa" w:w="1080"/>
+          </w:tcPr>
+          <w:p>
+            <w:r>
+              <w:rPr>
+                <w:sz w:val="18"/>
+              </w:rPr>
+              <w:t>541,811</w:t>
+            </w:r>
+          </w:p>
+        </w:tc>
+        <w:tc>
+          <w:tcPr>
+            <w:tcW w:type="dxa" w:w="1080"/>
+          </w:tcPr>
+          <w:p>
+            <w:r>
+              <w:rPr>
+                <w:sz w:val="18"/>
+              </w:rPr>
+              <w:t>26,263</w:t>
+            </w:r>
+          </w:p>
+        </w:tc>
+        <w:tc>
+          <w:tcPr>
+            <w:tcW w:type="dxa" w:w="1080"/>
+          </w:tcPr>
+          <w:p>
+            <w:r>
+              <w:rPr>
+                <w:sz w:val="18"/>
+              </w:rPr>
+              <w:t>4.8%</w:t>
+            </w:r>
+          </w:p>
+        </w:tc>
+        <w:tc>
+          <w:tcPr>
+            <w:tcW w:type="dxa" w:w="1080"/>
+          </w:tcPr>
+          <w:p>
+            <w:r>
+              <w:rPr>
+                <w:sz w:val="18"/>
+              </w:rPr>
+              <w:t>500,880</w:t>
+            </w:r>
+          </w:p>
+        </w:tc>
+        <w:tc>
+          <w:tcPr>
+            <w:tcW w:type="dxa" w:w="1080"/>
+          </w:tcPr>
+          <w:p>
+            <w:r>
+              <w:rPr>
+                <w:sz w:val="18"/>
+              </w:rPr>
+              <w:t>581,160</w:t>
+            </w:r>
+          </w:p>
+        </w:tc>
+        <w:tc>
+          <w:tcPr>
+            <w:tcW w:type="dxa" w:w="1080"/>
+          </w:tcPr>
+          <w:p>
+            <w:r>
+              <w:rPr>
+                <w:sz w:val="18"/>
+              </w:rPr>
+              <w:t>80,280</w:t>
             </w:r>
           </w:p>
         </w:tc>
@@ -5175,85 +5175,85 @@
               <w:rPr>
                 <w:sz w:val="18"/>
               </w:rPr>
-              <w:t>MySQL 9.7.0</w:t>
-            </w:r>
-          </w:p>
-        </w:tc>
-        <w:tc>
-          <w:tcPr>
-            <w:tcW w:type="dxa" w:w="1080"/>
-          </w:tcPr>
-          <w:p>
-            <w:r>
-              <w:rPr>
-                <w:sz w:val="18"/>
-              </w:rPr>
-              <w:t>603,991</w:t>
-            </w:r>
-          </w:p>
-        </w:tc>
-        <w:tc>
-          <w:tcPr>
-            <w:tcW w:type="dxa" w:w="1080"/>
-          </w:tcPr>
-          <w:p>
-            <w:r>
-              <w:rPr>
-                <w:sz w:val="18"/>
-              </w:rPr>
-              <w:t>22,009</w:t>
-            </w:r>
-          </w:p>
-        </w:tc>
-        <w:tc>
-          <w:tcPr>
-            <w:tcW w:type="dxa" w:w="1080"/>
-          </w:tcPr>
-          <w:p>
-            <w:r>
-              <w:rPr>
-                <w:sz w:val="18"/>
-              </w:rPr>
-              <w:t>3.6%</w:t>
-            </w:r>
-          </w:p>
-        </w:tc>
-        <w:tc>
-          <w:tcPr>
-            <w:tcW w:type="dxa" w:w="1080"/>
-          </w:tcPr>
-          <w:p>
-            <w:r>
-              <w:rPr>
-                <w:sz w:val="18"/>
-              </w:rPr>
-              <w:t>562,380</w:t>
-            </w:r>
-          </w:p>
-        </w:tc>
-        <w:tc>
-          <w:tcPr>
-            <w:tcW w:type="dxa" w:w="1080"/>
-          </w:tcPr>
-          <w:p>
-            <w:r>
-              <w:rPr>
-                <w:sz w:val="18"/>
-              </w:rPr>
-              <w:t>629,460</w:t>
-            </w:r>
-          </w:p>
-        </w:tc>
-        <w:tc>
-          <w:tcPr>
-            <w:tcW w:type="dxa" w:w="1080"/>
-          </w:tcPr>
-          <w:p>
-            <w:r>
-              <w:rPr>
-                <w:sz w:val="18"/>
-              </w:rPr>
-              <w:t>67,080</w:t>
+              <w:t>MariaDB 12.3.1</w:t>
+            </w:r>
+          </w:p>
+        </w:tc>
+        <w:tc>
+          <w:tcPr>
+            <w:tcW w:type="dxa" w:w="1080"/>
+          </w:tcPr>
+          <w:p>
+            <w:r>
+              <w:rPr>
+                <w:sz w:val="18"/>
+              </w:rPr>
+              <w:t>519,306</w:t>
+            </w:r>
+          </w:p>
+        </w:tc>
+        <w:tc>
+          <w:tcPr>
+            <w:tcW w:type="dxa" w:w="1080"/>
+          </w:tcPr>
+          <w:p>
+            <w:r>
+              <w:rPr>
+                <w:sz w:val="18"/>
+              </w:rPr>
+              <w:t>29,548</w:t>
+            </w:r>
+          </w:p>
+        </w:tc>
+        <w:tc>
+          <w:tcPr>
+            <w:tcW w:type="dxa" w:w="1080"/>
+          </w:tcPr>
+          <w:p>
+            <w:r>
+              <w:rPr>
+                <w:sz w:val="18"/>
+              </w:rPr>
+              <w:t>5.7%</w:t>
+            </w:r>
+          </w:p>
+        </w:tc>
+        <w:tc>
+          <w:tcPr>
+            <w:tcW w:type="dxa" w:w="1080"/>
+          </w:tcPr>
+          <w:p>
+            <w:r>
+              <w:rPr>
+                <w:sz w:val="18"/>
+              </w:rPr>
+              <w:t>473,040</w:t>
+            </w:r>
+          </w:p>
+        </w:tc>
+        <w:tc>
+          <w:tcPr>
+            <w:tcW w:type="dxa" w:w="1080"/>
+          </w:tcPr>
+          <w:p>
+            <w:r>
+              <w:rPr>
+                <w:sz w:val="18"/>
+              </w:rPr>
+              <w:t>566,760</w:t>
+            </w:r>
+          </w:p>
+        </w:tc>
+        <w:tc>
+          <w:tcPr>
+            <w:tcW w:type="dxa" w:w="1080"/>
+          </w:tcPr>
+          <w:p>
+            <w:r>
+              <w:rPr>
+                <w:sz w:val="18"/>
+              </w:rPr>
+              <w:t>93,720</w:t>
             </w:r>
           </w:p>
         </w:tc>
@@ -5268,98 +5268,98 @@
               <w:rPr>
                 <w:sz w:val="18"/>
               </w:rPr>
-              <w:t>40 VU</w:t>
-            </w:r>
-          </w:p>
-        </w:tc>
-        <w:tc>
-          <w:tcPr>
-            <w:tcW w:type="dxa" w:w="1080"/>
-          </w:tcPr>
-          <w:p>
-            <w:r>
-              <w:rPr>
-                <w:sz w:val="18"/>
-              </w:rPr>
-              <w:t>MariaDB 12.3.1</w:t>
-            </w:r>
-          </w:p>
-        </w:tc>
-        <w:tc>
-          <w:tcPr>
-            <w:tcW w:type="dxa" w:w="1080"/>
-          </w:tcPr>
-          <w:p>
-            <w:r>
-              <w:rPr>
-                <w:sz w:val="18"/>
-              </w:rPr>
-              <w:t>811,552</w:t>
-            </w:r>
-          </w:p>
-        </w:tc>
-        <w:tc>
-          <w:tcPr>
-            <w:tcW w:type="dxa" w:w="1080"/>
-          </w:tcPr>
-          <w:p>
-            <w:r>
-              <w:rPr>
-                <w:sz w:val="18"/>
-              </w:rPr>
-              <w:t>48,059</w:t>
-            </w:r>
-          </w:p>
-        </w:tc>
-        <w:tc>
-          <w:tcPr>
-            <w:tcW w:type="dxa" w:w="1080"/>
-          </w:tcPr>
-          <w:p>
-            <w:r>
-              <w:rPr>
-                <w:sz w:val="18"/>
-              </w:rPr>
-              <w:t>5.9%</w:t>
-            </w:r>
-          </w:p>
-        </w:tc>
-        <w:tc>
-          <w:tcPr>
-            <w:tcW w:type="dxa" w:w="1080"/>
-          </w:tcPr>
-          <w:p>
-            <w:r>
-              <w:rPr>
-                <w:sz w:val="18"/>
-              </w:rPr>
-              <w:t>737,340</w:t>
-            </w:r>
-          </w:p>
-        </w:tc>
-        <w:tc>
-          <w:tcPr>
-            <w:tcW w:type="dxa" w:w="1080"/>
-          </w:tcPr>
-          <w:p>
-            <w:r>
-              <w:rPr>
-                <w:sz w:val="18"/>
-              </w:rPr>
-              <w:t>896,700</w:t>
-            </w:r>
-          </w:p>
-        </w:tc>
-        <w:tc>
-          <w:tcPr>
-            <w:tcW w:type="dxa" w:w="1080"/>
-          </w:tcPr>
-          <w:p>
-            <w:r>
-              <w:rPr>
-                <w:sz w:val="18"/>
-              </w:rPr>
-              <w:t>159,360</w:t>
+              <w:t>20 VU</w:t>
+            </w:r>
+          </w:p>
+        </w:tc>
+        <w:tc>
+          <w:tcPr>
+            <w:tcW w:type="dxa" w:w="1080"/>
+          </w:tcPr>
+          <w:p>
+            <w:r>
+              <w:rPr>
+                <w:sz w:val="18"/>
+              </w:rPr>
+              <w:t>MySQL 8.4.8</w:t>
+            </w:r>
+          </w:p>
+        </w:tc>
+        <w:tc>
+          <w:tcPr>
+            <w:tcW w:type="dxa" w:w="1080"/>
+          </w:tcPr>
+          <w:p>
+            <w:r>
+              <w:rPr>
+                <w:sz w:val="18"/>
+              </w:rPr>
+              <w:t>506,616</w:t>
+            </w:r>
+          </w:p>
+        </w:tc>
+        <w:tc>
+          <w:tcPr>
+            <w:tcW w:type="dxa" w:w="1080"/>
+          </w:tcPr>
+          <w:p>
+            <w:r>
+              <w:rPr>
+                <w:sz w:val="18"/>
+              </w:rPr>
+              <w:t>19,442</w:t>
+            </w:r>
+          </w:p>
+        </w:tc>
+        <w:tc>
+          <w:tcPr>
+            <w:tcW w:type="dxa" w:w="1080"/>
+          </w:tcPr>
+          <w:p>
+            <w:r>
+              <w:rPr>
+                <w:sz w:val="18"/>
+              </w:rPr>
+              <w:t>3.8%</w:t>
+            </w:r>
+          </w:p>
+        </w:tc>
+        <w:tc>
+          <w:tcPr>
+            <w:tcW w:type="dxa" w:w="1080"/>
+          </w:tcPr>
+          <w:p>
+            <w:r>
+              <w:rPr>
+                <w:sz w:val="18"/>
+              </w:rPr>
+              <w:t>471,540</w:t>
+            </w:r>
+          </w:p>
+        </w:tc>
+        <w:tc>
+          <w:tcPr>
+            <w:tcW w:type="dxa" w:w="1080"/>
+          </w:tcPr>
+          <w:p>
+            <w:r>
+              <w:rPr>
+                <w:sz w:val="18"/>
+              </w:rPr>
+              <w:t>528,660</w:t>
+            </w:r>
+          </w:p>
+        </w:tc>
+        <w:tc>
+          <w:tcPr>
+            <w:tcW w:type="dxa" w:w="1080"/>
+          </w:tcPr>
+          <w:p>
+            <w:r>
+              <w:rPr>
+                <w:sz w:val="18"/>
+              </w:rPr>
+              <w:t>57,120</w:t>
             </w:r>
           </w:p>
         </w:tc>
@@ -5374,98 +5374,98 @@
               <w:rPr>
                 <w:sz w:val="18"/>
               </w:rPr>
-              <w:t>40 VU</w:t>
-            </w:r>
-          </w:p>
-        </w:tc>
-        <w:tc>
-          <w:tcPr>
-            <w:tcW w:type="dxa" w:w="1080"/>
-          </w:tcPr>
-          <w:p>
-            <w:r>
-              <w:rPr>
-                <w:sz w:val="18"/>
-              </w:rPr>
-              <w:t>MySQL 8.4.8</w:t>
-            </w:r>
-          </w:p>
-        </w:tc>
-        <w:tc>
-          <w:tcPr>
-            <w:tcW w:type="dxa" w:w="1080"/>
-          </w:tcPr>
-          <w:p>
-            <w:r>
-              <w:rPr>
-                <w:sz w:val="18"/>
-              </w:rPr>
-              <w:t>800,838</w:t>
-            </w:r>
-          </w:p>
-        </w:tc>
-        <w:tc>
-          <w:tcPr>
-            <w:tcW w:type="dxa" w:w="1080"/>
-          </w:tcPr>
-          <w:p>
-            <w:r>
-              <w:rPr>
-                <w:sz w:val="18"/>
-              </w:rPr>
-              <w:t>26,530</w:t>
-            </w:r>
-          </w:p>
-        </w:tc>
-        <w:tc>
-          <w:tcPr>
-            <w:tcW w:type="dxa" w:w="1080"/>
-          </w:tcPr>
-          <w:p>
-            <w:r>
-              <w:rPr>
-                <w:sz w:val="18"/>
-              </w:rPr>
-              <w:t>3.3%</w:t>
-            </w:r>
-          </w:p>
-        </w:tc>
-        <w:tc>
-          <w:tcPr>
-            <w:tcW w:type="dxa" w:w="1080"/>
-          </w:tcPr>
-          <w:p>
-            <w:r>
-              <w:rPr>
-                <w:sz w:val="18"/>
-              </w:rPr>
-              <w:t>756,000</w:t>
-            </w:r>
-          </w:p>
-        </w:tc>
-        <w:tc>
-          <w:tcPr>
-            <w:tcW w:type="dxa" w:w="1080"/>
-          </w:tcPr>
-          <w:p>
-            <w:r>
-              <w:rPr>
-                <w:sz w:val="18"/>
-              </w:rPr>
-              <w:t>827,580</w:t>
-            </w:r>
-          </w:p>
-        </w:tc>
-        <w:tc>
-          <w:tcPr>
-            <w:tcW w:type="dxa" w:w="1080"/>
-          </w:tcPr>
-          <w:p>
-            <w:r>
-              <w:rPr>
-                <w:sz w:val="18"/>
-              </w:rPr>
-              <w:t>71,580</w:t>
+              <w:t>20 VU</w:t>
+            </w:r>
+          </w:p>
+        </w:tc>
+        <w:tc>
+          <w:tcPr>
+            <w:tcW w:type="dxa" w:w="1080"/>
+          </w:tcPr>
+          <w:p>
+            <w:r>
+              <w:rPr>
+                <w:sz w:val="18"/>
+              </w:rPr>
+              <w:t>MySQL 9.7.0</w:t>
+            </w:r>
+          </w:p>
+        </w:tc>
+        <w:tc>
+          <w:tcPr>
+            <w:tcW w:type="dxa" w:w="1080"/>
+          </w:tcPr>
+          <w:p>
+            <w:r>
+              <w:rPr>
+                <w:sz w:val="18"/>
+              </w:rPr>
+              <w:t>603,991</w:t>
+            </w:r>
+          </w:p>
+        </w:tc>
+        <w:tc>
+          <w:tcPr>
+            <w:tcW w:type="dxa" w:w="1080"/>
+          </w:tcPr>
+          <w:p>
+            <w:r>
+              <w:rPr>
+                <w:sz w:val="18"/>
+              </w:rPr>
+              <w:t>22,009</w:t>
+            </w:r>
+          </w:p>
+        </w:tc>
+        <w:tc>
+          <w:tcPr>
+            <w:tcW w:type="dxa" w:w="1080"/>
+          </w:tcPr>
+          <w:p>
+            <w:r>
+              <w:rPr>
+                <w:sz w:val="18"/>
+              </w:rPr>
+              <w:t>3.6%</w:t>
+            </w:r>
+          </w:p>
+        </w:tc>
+        <w:tc>
+          <w:tcPr>
+            <w:tcW w:type="dxa" w:w="1080"/>
+          </w:tcPr>
+          <w:p>
+            <w:r>
+              <w:rPr>
+                <w:sz w:val="18"/>
+              </w:rPr>
+              <w:t>562,380</w:t>
+            </w:r>
+          </w:p>
+        </w:tc>
+        <w:tc>
+          <w:tcPr>
+            <w:tcW w:type="dxa" w:w="1080"/>
+          </w:tcPr>
+          <w:p>
+            <w:r>
+              <w:rPr>
+                <w:sz w:val="18"/>
+              </w:rPr>
+              <w:t>629,460</w:t>
+            </w:r>
+          </w:p>
+        </w:tc>
+        <w:tc>
+          <w:tcPr>
+            <w:tcW w:type="dxa" w:w="1080"/>
+          </w:tcPr>
+          <w:p>
+            <w:r>
+              <w:rPr>
+                <w:sz w:val="18"/>
+              </w:rPr>
+              <w:t>67,080</w:t>
             </w:r>
           </w:p>
         </w:tc>
@@ -5493,85 +5493,85 @@
               <w:rPr>
                 <w:sz w:val="18"/>
               </w:rPr>
-              <w:t>MySQL 9.7.0</w:t>
-            </w:r>
-          </w:p>
-        </w:tc>
-        <w:tc>
-          <w:tcPr>
-            <w:tcW w:type="dxa" w:w="1080"/>
-          </w:tcPr>
-          <w:p>
-            <w:r>
-              <w:rPr>
-                <w:sz w:val="18"/>
-              </w:rPr>
-              <w:t>915,110</w:t>
-            </w:r>
-          </w:p>
-        </w:tc>
-        <w:tc>
-          <w:tcPr>
-            <w:tcW w:type="dxa" w:w="1080"/>
-          </w:tcPr>
-          <w:p>
-            <w:r>
-              <w:rPr>
-                <w:sz w:val="18"/>
-              </w:rPr>
-              <w:t>37,568</w:t>
-            </w:r>
-          </w:p>
-        </w:tc>
-        <w:tc>
-          <w:tcPr>
-            <w:tcW w:type="dxa" w:w="1080"/>
-          </w:tcPr>
-          <w:p>
-            <w:r>
-              <w:rPr>
-                <w:sz w:val="18"/>
-              </w:rPr>
-              <w:t>4.1%</w:t>
-            </w:r>
-          </w:p>
-        </w:tc>
-        <w:tc>
-          <w:tcPr>
-            <w:tcW w:type="dxa" w:w="1080"/>
-          </w:tcPr>
-          <w:p>
-            <w:r>
-              <w:rPr>
-                <w:sz w:val="18"/>
-              </w:rPr>
-              <w:t>848,640</w:t>
-            </w:r>
-          </w:p>
-        </w:tc>
-        <w:tc>
-          <w:tcPr>
-            <w:tcW w:type="dxa" w:w="1080"/>
-          </w:tcPr>
-          <w:p>
-            <w:r>
-              <w:rPr>
-                <w:sz w:val="18"/>
-              </w:rPr>
-              <w:t>962,040</w:t>
-            </w:r>
-          </w:p>
-        </w:tc>
-        <w:tc>
-          <w:tcPr>
-            <w:tcW w:type="dxa" w:w="1080"/>
-          </w:tcPr>
-          <w:p>
-            <w:r>
-              <w:rPr>
-                <w:sz w:val="18"/>
-              </w:rPr>
-              <w:t>113,400</w:t>
+              <w:t>MariaDB 12.2.2</w:t>
+            </w:r>
+          </w:p>
+        </w:tc>
+        <w:tc>
+          <w:tcPr>
+            <w:tcW w:type="dxa" w:w="1080"/>
+          </w:tcPr>
+          <w:p>
+            <w:r>
+              <w:rPr>
+                <w:sz w:val="18"/>
+              </w:rPr>
+              <w:t>849,380</w:t>
+            </w:r>
+          </w:p>
+        </w:tc>
+        <w:tc>
+          <w:tcPr>
+            <w:tcW w:type="dxa" w:w="1080"/>
+          </w:tcPr>
+          <w:p>
+            <w:r>
+              <w:rPr>
+                <w:sz w:val="18"/>
+              </w:rPr>
+              <w:t>40,668</w:t>
+            </w:r>
+          </w:p>
+        </w:tc>
+        <w:tc>
+          <w:tcPr>
+            <w:tcW w:type="dxa" w:w="1080"/>
+          </w:tcPr>
+          <w:p>
+            <w:r>
+              <w:rPr>
+                <w:sz w:val="18"/>
+              </w:rPr>
+              <w:t>4.8%</w:t>
+            </w:r>
+          </w:p>
+        </w:tc>
+        <w:tc>
+          <w:tcPr>
+            <w:tcW w:type="dxa" w:w="1080"/>
+          </w:tcPr>
+          <w:p>
+            <w:r>
+              <w:rPr>
+                <w:sz w:val="18"/>
+              </w:rPr>
+              <w:t>781,980</w:t>
+            </w:r>
+          </w:p>
+        </w:tc>
+        <w:tc>
+          <w:tcPr>
+            <w:tcW w:type="dxa" w:w="1080"/>
+          </w:tcPr>
+          <w:p>
+            <w:r>
+              <w:rPr>
+                <w:sz w:val="18"/>
+              </w:rPr>
+              <w:t>909,600</w:t>
+            </w:r>
+          </w:p>
+        </w:tc>
+        <w:tc>
+          <w:tcPr>
+            <w:tcW w:type="dxa" w:w="1080"/>
+          </w:tcPr>
+          <w:p>
+            <w:r>
+              <w:rPr>
+                <w:sz w:val="18"/>
+              </w:rPr>
+              <w:t>127,620</w:t>
             </w:r>
           </w:p>
         </w:tc>
@@ -5586,98 +5586,98 @@
               <w:rPr>
                 <w:sz w:val="18"/>
               </w:rPr>
-              <w:t>80 VU</w:t>
-            </w:r>
-          </w:p>
-        </w:tc>
-        <w:tc>
-          <w:tcPr>
-            <w:tcW w:type="dxa" w:w="1080"/>
-          </w:tcPr>
-          <w:p>
-            <w:r>
-              <w:rPr>
-                <w:sz w:val="18"/>
-              </w:rPr>
-              <w:t>MariaDB 12.2.2</w:t>
-            </w:r>
-          </w:p>
-        </w:tc>
-        <w:tc>
-          <w:tcPr>
-            <w:tcW w:type="dxa" w:w="1080"/>
-          </w:tcPr>
-          <w:p>
-            <w:r>
-              <w:rPr>
-                <w:sz w:val="18"/>
-              </w:rPr>
-              <w:t>1,148,907</w:t>
-            </w:r>
-          </w:p>
-        </w:tc>
-        <w:tc>
-          <w:tcPr>
-            <w:tcW w:type="dxa" w:w="1080"/>
-          </w:tcPr>
-          <w:p>
-            <w:r>
-              <w:rPr>
-                <w:sz w:val="18"/>
-              </w:rPr>
-              <w:t>42,925</w:t>
-            </w:r>
-          </w:p>
-        </w:tc>
-        <w:tc>
-          <w:tcPr>
-            <w:tcW w:type="dxa" w:w="1080"/>
-          </w:tcPr>
-          <w:p>
-            <w:r>
-              <w:rPr>
-                <w:sz w:val="18"/>
-              </w:rPr>
-              <w:t>3.7%</w:t>
-            </w:r>
-          </w:p>
-        </w:tc>
-        <w:tc>
-          <w:tcPr>
-            <w:tcW w:type="dxa" w:w="1080"/>
-          </w:tcPr>
-          <w:p>
-            <w:r>
-              <w:rPr>
-                <w:sz w:val="18"/>
-              </w:rPr>
-              <w:t>1,073,040</w:t>
-            </w:r>
-          </w:p>
-        </w:tc>
-        <w:tc>
-          <w:tcPr>
-            <w:tcW w:type="dxa" w:w="1080"/>
-          </w:tcPr>
-          <w:p>
-            <w:r>
-              <w:rPr>
-                <w:sz w:val="18"/>
-              </w:rPr>
-              <w:t>1,199,520</w:t>
-            </w:r>
-          </w:p>
-        </w:tc>
-        <w:tc>
-          <w:tcPr>
-            <w:tcW w:type="dxa" w:w="1080"/>
-          </w:tcPr>
-          <w:p>
-            <w:r>
-              <w:rPr>
-                <w:sz w:val="18"/>
-              </w:rPr>
-              <w:t>126,480</w:t>
+              <w:t>40 VU</w:t>
+            </w:r>
+          </w:p>
+        </w:tc>
+        <w:tc>
+          <w:tcPr>
+            <w:tcW w:type="dxa" w:w="1080"/>
+          </w:tcPr>
+          <w:p>
+            <w:r>
+              <w:rPr>
+                <w:sz w:val="18"/>
+              </w:rPr>
+              <w:t>MariaDB 12.3.1</w:t>
+            </w:r>
+          </w:p>
+        </w:tc>
+        <w:tc>
+          <w:tcPr>
+            <w:tcW w:type="dxa" w:w="1080"/>
+          </w:tcPr>
+          <w:p>
+            <w:r>
+              <w:rPr>
+                <w:sz w:val="18"/>
+              </w:rPr>
+              <w:t>811,552</w:t>
+            </w:r>
+          </w:p>
+        </w:tc>
+        <w:tc>
+          <w:tcPr>
+            <w:tcW w:type="dxa" w:w="1080"/>
+          </w:tcPr>
+          <w:p>
+            <w:r>
+              <w:rPr>
+                <w:sz w:val="18"/>
+              </w:rPr>
+              <w:t>48,059</w:t>
+            </w:r>
+          </w:p>
+        </w:tc>
+        <w:tc>
+          <w:tcPr>
+            <w:tcW w:type="dxa" w:w="1080"/>
+          </w:tcPr>
+          <w:p>
+            <w:r>
+              <w:rPr>
+                <w:sz w:val="18"/>
+              </w:rPr>
+              <w:t>5.9%</w:t>
+            </w:r>
+          </w:p>
+        </w:tc>
+        <w:tc>
+          <w:tcPr>
+            <w:tcW w:type="dxa" w:w="1080"/>
+          </w:tcPr>
+          <w:p>
+            <w:r>
+              <w:rPr>
+                <w:sz w:val="18"/>
+              </w:rPr>
+              <w:t>737,340</w:t>
+            </w:r>
+          </w:p>
+        </w:tc>
+        <w:tc>
+          <w:tcPr>
+            <w:tcW w:type="dxa" w:w="1080"/>
+          </w:tcPr>
+          <w:p>
+            <w:r>
+              <w:rPr>
+                <w:sz w:val="18"/>
+              </w:rPr>
+              <w:t>896,700</w:t>
+            </w:r>
+          </w:p>
+        </w:tc>
+        <w:tc>
+          <w:tcPr>
+            <w:tcW w:type="dxa" w:w="1080"/>
+          </w:tcPr>
+          <w:p>
+            <w:r>
+              <w:rPr>
+                <w:sz w:val="18"/>
+              </w:rPr>
+              <w:t>159,360</w:t>
             </w:r>
           </w:p>
         </w:tc>
@@ -5692,98 +5692,98 @@
               <w:rPr>
                 <w:sz w:val="18"/>
               </w:rPr>
-              <w:t>80 VU</w:t>
-            </w:r>
-          </w:p>
-        </w:tc>
-        <w:tc>
-          <w:tcPr>
-            <w:tcW w:type="dxa" w:w="1080"/>
-          </w:tcPr>
-          <w:p>
-            <w:r>
-              <w:rPr>
-                <w:sz w:val="18"/>
-              </w:rPr>
-              <w:t>MariaDB 12.3.1</w:t>
-            </w:r>
-          </w:p>
-        </w:tc>
-        <w:tc>
-          <w:tcPr>
-            <w:tcW w:type="dxa" w:w="1080"/>
-          </w:tcPr>
-          <w:p>
-            <w:r>
-              <w:rPr>
-                <w:sz w:val="18"/>
-              </w:rPr>
-              <w:t>1,108,372</w:t>
-            </w:r>
-          </w:p>
-        </w:tc>
-        <w:tc>
-          <w:tcPr>
-            <w:tcW w:type="dxa" w:w="1080"/>
-          </w:tcPr>
-          <w:p>
-            <w:r>
-              <w:rPr>
-                <w:sz w:val="18"/>
-              </w:rPr>
-              <w:t>45,859</w:t>
-            </w:r>
-          </w:p>
-        </w:tc>
-        <w:tc>
-          <w:tcPr>
-            <w:tcW w:type="dxa" w:w="1080"/>
-          </w:tcPr>
-          <w:p>
-            <w:r>
-              <w:rPr>
-                <w:sz w:val="18"/>
-              </w:rPr>
-              <w:t>4.1%</w:t>
-            </w:r>
-          </w:p>
-        </w:tc>
-        <w:tc>
-          <w:tcPr>
-            <w:tcW w:type="dxa" w:w="1080"/>
-          </w:tcPr>
-          <w:p>
-            <w:r>
-              <w:rPr>
-                <w:sz w:val="18"/>
-              </w:rPr>
-              <w:t>1,034,400</w:t>
-            </w:r>
-          </w:p>
-        </w:tc>
-        <w:tc>
-          <w:tcPr>
-            <w:tcW w:type="dxa" w:w="1080"/>
-          </w:tcPr>
-          <w:p>
-            <w:r>
-              <w:rPr>
-                <w:sz w:val="18"/>
-              </w:rPr>
-              <w:t>1,172,880</w:t>
-            </w:r>
-          </w:p>
-        </w:tc>
-        <w:tc>
-          <w:tcPr>
-            <w:tcW w:type="dxa" w:w="1080"/>
-          </w:tcPr>
-          <w:p>
-            <w:r>
-              <w:rPr>
-                <w:sz w:val="18"/>
-              </w:rPr>
-              <w:t>138,480</w:t>
+              <w:t>40 VU</w:t>
+            </w:r>
+          </w:p>
+        </w:tc>
+        <w:tc>
+          <w:tcPr>
+            <w:tcW w:type="dxa" w:w="1080"/>
+          </w:tcPr>
+          <w:p>
+            <w:r>
+              <w:rPr>
+                <w:sz w:val="18"/>
+              </w:rPr>
+              <w:t>MySQL 8.4.8</w:t>
+            </w:r>
+          </w:p>
+        </w:tc>
+        <w:tc>
+          <w:tcPr>
+            <w:tcW w:type="dxa" w:w="1080"/>
+          </w:tcPr>
+          <w:p>
+            <w:r>
+              <w:rPr>
+                <w:sz w:val="18"/>
+              </w:rPr>
+              <w:t>800,838</w:t>
+            </w:r>
+          </w:p>
+        </w:tc>
+        <w:tc>
+          <w:tcPr>
+            <w:tcW w:type="dxa" w:w="1080"/>
+          </w:tcPr>
+          <w:p>
+            <w:r>
+              <w:rPr>
+                <w:sz w:val="18"/>
+              </w:rPr>
+              <w:t>26,530</w:t>
+            </w:r>
+          </w:p>
+        </w:tc>
+        <w:tc>
+          <w:tcPr>
+            <w:tcW w:type="dxa" w:w="1080"/>
+          </w:tcPr>
+          <w:p>
+            <w:r>
+              <w:rPr>
+                <w:sz w:val="18"/>
+              </w:rPr>
+              <w:t>3.3%</w:t>
+            </w:r>
+          </w:p>
+        </w:tc>
+        <w:tc>
+          <w:tcPr>
+            <w:tcW w:type="dxa" w:w="1080"/>
+          </w:tcPr>
+          <w:p>
+            <w:r>
+              <w:rPr>
+                <w:sz w:val="18"/>
+              </w:rPr>
+              <w:t>756,000</w:t>
+            </w:r>
+          </w:p>
+        </w:tc>
+        <w:tc>
+          <w:tcPr>
+            <w:tcW w:type="dxa" w:w="1080"/>
+          </w:tcPr>
+          <w:p>
+            <w:r>
+              <w:rPr>
+                <w:sz w:val="18"/>
+              </w:rPr>
+              <w:t>827,580</w:t>
+            </w:r>
+          </w:p>
+        </w:tc>
+        <w:tc>
+          <w:tcPr>
+            <w:tcW w:type="dxa" w:w="1080"/>
+          </w:tcPr>
+          <w:p>
+            <w:r>
+              <w:rPr>
+                <w:sz w:val="18"/>
+              </w:rPr>
+              <w:t>71,580</w:t>
             </w:r>
           </w:p>
         </w:tc>
@@ -5798,98 +5798,98 @@
               <w:rPr>
                 <w:sz w:val="18"/>
               </w:rPr>
-              <w:t>80 VU</w:t>
-            </w:r>
-          </w:p>
-        </w:tc>
-        <w:tc>
-          <w:tcPr>
-            <w:tcW w:type="dxa" w:w="1080"/>
-          </w:tcPr>
-          <w:p>
-            <w:r>
-              <w:rPr>
-                <w:sz w:val="18"/>
-              </w:rPr>
-              <w:t>MySQL 8.4.8</w:t>
-            </w:r>
-          </w:p>
-        </w:tc>
-        <w:tc>
-          <w:tcPr>
-            <w:tcW w:type="dxa" w:w="1080"/>
-          </w:tcPr>
-          <w:p>
-            <w:r>
-              <w:rPr>
-                <w:sz w:val="18"/>
-              </w:rPr>
-              <w:t>1,024,983</w:t>
-            </w:r>
-          </w:p>
-        </w:tc>
-        <w:tc>
-          <w:tcPr>
-            <w:tcW w:type="dxa" w:w="1080"/>
-          </w:tcPr>
-          <w:p>
-            <w:r>
-              <w:rPr>
-                <w:sz w:val="18"/>
-              </w:rPr>
-              <w:t>37,813</w:t>
-            </w:r>
-          </w:p>
-        </w:tc>
-        <w:tc>
-          <w:tcPr>
-            <w:tcW w:type="dxa" w:w="1080"/>
-          </w:tcPr>
-          <w:p>
-            <w:r>
-              <w:rPr>
-                <w:sz w:val="18"/>
-              </w:rPr>
-              <w:t>3.7%</w:t>
-            </w:r>
-          </w:p>
-        </w:tc>
-        <w:tc>
-          <w:tcPr>
-            <w:tcW w:type="dxa" w:w="1080"/>
-          </w:tcPr>
-          <w:p>
-            <w:r>
-              <w:rPr>
-                <w:sz w:val="18"/>
-              </w:rPr>
-              <w:t>953,580</w:t>
-            </w:r>
-          </w:p>
-        </w:tc>
-        <w:tc>
-          <w:tcPr>
-            <w:tcW w:type="dxa" w:w="1080"/>
-          </w:tcPr>
-          <w:p>
-            <w:r>
-              <w:rPr>
-                <w:sz w:val="18"/>
-              </w:rPr>
-              <w:t>1,055,160</w:t>
-            </w:r>
-          </w:p>
-        </w:tc>
-        <w:tc>
-          <w:tcPr>
-            <w:tcW w:type="dxa" w:w="1080"/>
-          </w:tcPr>
-          <w:p>
-            <w:r>
-              <w:rPr>
-                <w:sz w:val="18"/>
-              </w:rPr>
-              <w:t>101,580</w:t>
+              <w:t>40 VU</w:t>
+            </w:r>
+          </w:p>
+        </w:tc>
+        <w:tc>
+          <w:tcPr>
+            <w:tcW w:type="dxa" w:w="1080"/>
+          </w:tcPr>
+          <w:p>
+            <w:r>
+              <w:rPr>
+                <w:sz w:val="18"/>
+              </w:rPr>
+              <w:t>MySQL 9.7.0</w:t>
+            </w:r>
+          </w:p>
+        </w:tc>
+        <w:tc>
+          <w:tcPr>
+            <w:tcW w:type="dxa" w:w="1080"/>
+          </w:tcPr>
+          <w:p>
+            <w:r>
+              <w:rPr>
+                <w:sz w:val="18"/>
+              </w:rPr>
+              <w:t>915,110</w:t>
+            </w:r>
+          </w:p>
+        </w:tc>
+        <w:tc>
+          <w:tcPr>
+            <w:tcW w:type="dxa" w:w="1080"/>
+          </w:tcPr>
+          <w:p>
+            <w:r>
+              <w:rPr>
+                <w:sz w:val="18"/>
+              </w:rPr>
+              <w:t>37,568</w:t>
+            </w:r>
+          </w:p>
+        </w:tc>
+        <w:tc>
+          <w:tcPr>
+            <w:tcW w:type="dxa" w:w="1080"/>
+          </w:tcPr>
+          <w:p>
+            <w:r>
+              <w:rPr>
+                <w:sz w:val="18"/>
+              </w:rPr>
+              <w:t>4.1%</w:t>
+            </w:r>
+          </w:p>
+        </w:tc>
+        <w:tc>
+          <w:tcPr>
+            <w:tcW w:type="dxa" w:w="1080"/>
+          </w:tcPr>
+          <w:p>
+            <w:r>
+              <w:rPr>
+                <w:sz w:val="18"/>
+              </w:rPr>
+              <w:t>848,640</w:t>
+            </w:r>
+          </w:p>
+        </w:tc>
+        <w:tc>
+          <w:tcPr>
+            <w:tcW w:type="dxa" w:w="1080"/>
+          </w:tcPr>
+          <w:p>
+            <w:r>
+              <w:rPr>
+                <w:sz w:val="18"/>
+              </w:rPr>
+              <w:t>962,040</w:t>
+            </w:r>
+          </w:p>
+        </w:tc>
+        <w:tc>
+          <w:tcPr>
+            <w:tcW w:type="dxa" w:w="1080"/>
+          </w:tcPr>
+          <w:p>
+            <w:r>
+              <w:rPr>
+                <w:sz w:val="18"/>
+              </w:rPr>
+              <w:t>113,400</w:t>
             </w:r>
           </w:p>
         </w:tc>
@@ -5917,33 +5917,33 @@
               <w:rPr>
                 <w:sz w:val="18"/>
               </w:rPr>
-              <w:t>MySQL 9.7.0</w:t>
-            </w:r>
-          </w:p>
-        </w:tc>
-        <w:tc>
-          <w:tcPr>
-            <w:tcW w:type="dxa" w:w="1080"/>
-          </w:tcPr>
-          <w:p>
-            <w:r>
-              <w:rPr>
-                <w:sz w:val="18"/>
-              </w:rPr>
-              <w:t>1,165,157</w:t>
-            </w:r>
-          </w:p>
-        </w:tc>
-        <w:tc>
-          <w:tcPr>
-            <w:tcW w:type="dxa" w:w="1080"/>
-          </w:tcPr>
-          <w:p>
-            <w:r>
-              <w:rPr>
-                <w:sz w:val="18"/>
-              </w:rPr>
-              <w:t>46,019</w:t>
+              <w:t>MariaDB 12.2.2</w:t>
+            </w:r>
+          </w:p>
+        </w:tc>
+        <w:tc>
+          <w:tcPr>
+            <w:tcW w:type="dxa" w:w="1080"/>
+          </w:tcPr>
+          <w:p>
+            <w:r>
+              <w:rPr>
+                <w:sz w:val="18"/>
+              </w:rPr>
+              <w:t>1,158,569</w:t>
+            </w:r>
+          </w:p>
+        </w:tc>
+        <w:tc>
+          <w:tcPr>
+            <w:tcW w:type="dxa" w:w="1080"/>
+          </w:tcPr>
+          <w:p>
+            <w:r>
+              <w:rPr>
+                <w:sz w:val="18"/>
+              </w:rPr>
+              <w:t>45,870</w:t>
             </w:r>
           </w:p>
         </w:tc>
@@ -5969,33 +5969,33 @@
               <w:rPr>
                 <w:sz w:val="18"/>
               </w:rPr>
-              <w:t>1,082,400</w:t>
-            </w:r>
-          </w:p>
-        </w:tc>
-        <w:tc>
-          <w:tcPr>
-            <w:tcW w:type="dxa" w:w="1080"/>
-          </w:tcPr>
-          <w:p>
-            <w:r>
-              <w:rPr>
-                <w:sz w:val="18"/>
-              </w:rPr>
-              <w:t>1,208,280</w:t>
-            </w:r>
-          </w:p>
-        </w:tc>
-        <w:tc>
-          <w:tcPr>
-            <w:tcW w:type="dxa" w:w="1080"/>
-          </w:tcPr>
-          <w:p>
-            <w:r>
-              <w:rPr>
-                <w:sz w:val="18"/>
-              </w:rPr>
-              <w:t>125,880</w:t>
+              <w:t>1,087,080</w:t>
+            </w:r>
+          </w:p>
+        </w:tc>
+        <w:tc>
+          <w:tcPr>
+            <w:tcW w:type="dxa" w:w="1080"/>
+          </w:tcPr>
+          <w:p>
+            <w:r>
+              <w:rPr>
+                <w:sz w:val="18"/>
+              </w:rPr>
+              <w:t>1,204,680</w:t>
+            </w:r>
+          </w:p>
+        </w:tc>
+        <w:tc>
+          <w:tcPr>
+            <w:tcW w:type="dxa" w:w="1080"/>
+          </w:tcPr>
+          <w:p>
+            <w:r>
+              <w:rPr>
+                <w:sz w:val="18"/>
+              </w:rPr>
+              <w:t>117,600</w:t>
             </w:r>
           </w:p>
         </w:tc>
@@ -6010,7 +6010,7 @@
               <w:rPr>
                 <w:sz w:val="18"/>
               </w:rPr>
-              <w:t>160 VU</w:t>
+              <w:t>80 VU</w:t>
             </w:r>
           </w:p>
         </w:tc>
@@ -6036,72 +6036,72 @@
               <w:rPr>
                 <w:sz w:val="18"/>
               </w:rPr>
-              <w:t>1,215,432</w:t>
-            </w:r>
-          </w:p>
-        </w:tc>
-        <w:tc>
-          <w:tcPr>
-            <w:tcW w:type="dxa" w:w="1080"/>
-          </w:tcPr>
-          <w:p>
-            <w:r>
-              <w:rPr>
-                <w:sz w:val="18"/>
-              </w:rPr>
-              <w:t>29,388</w:t>
-            </w:r>
-          </w:p>
-        </w:tc>
-        <w:tc>
-          <w:tcPr>
-            <w:tcW w:type="dxa" w:w="1080"/>
-          </w:tcPr>
-          <w:p>
-            <w:r>
-              <w:rPr>
-                <w:sz w:val="18"/>
-              </w:rPr>
-              <w:t>2.4%</w:t>
-            </w:r>
-          </w:p>
-        </w:tc>
-        <w:tc>
-          <w:tcPr>
-            <w:tcW w:type="dxa" w:w="1080"/>
-          </w:tcPr>
-          <w:p>
-            <w:r>
-              <w:rPr>
-                <w:sz w:val="18"/>
-              </w:rPr>
-              <w:t>1,170,540</w:t>
-            </w:r>
-          </w:p>
-        </w:tc>
-        <w:tc>
-          <w:tcPr>
-            <w:tcW w:type="dxa" w:w="1080"/>
-          </w:tcPr>
-          <w:p>
-            <w:r>
-              <w:rPr>
-                <w:sz w:val="18"/>
-              </w:rPr>
-              <w:t>1,238,100</w:t>
-            </w:r>
-          </w:p>
-        </w:tc>
-        <w:tc>
-          <w:tcPr>
-            <w:tcW w:type="dxa" w:w="1080"/>
-          </w:tcPr>
-          <w:p>
-            <w:r>
-              <w:rPr>
-                <w:sz w:val="18"/>
-              </w:rPr>
-              <w:t>67,560</w:t>
+              <w:t>1,108,372</w:t>
+            </w:r>
+          </w:p>
+        </w:tc>
+        <w:tc>
+          <w:tcPr>
+            <w:tcW w:type="dxa" w:w="1080"/>
+          </w:tcPr>
+          <w:p>
+            <w:r>
+              <w:rPr>
+                <w:sz w:val="18"/>
+              </w:rPr>
+              <w:t>45,859</w:t>
+            </w:r>
+          </w:p>
+        </w:tc>
+        <w:tc>
+          <w:tcPr>
+            <w:tcW w:type="dxa" w:w="1080"/>
+          </w:tcPr>
+          <w:p>
+            <w:r>
+              <w:rPr>
+                <w:sz w:val="18"/>
+              </w:rPr>
+              <w:t>4.1%</w:t>
+            </w:r>
+          </w:p>
+        </w:tc>
+        <w:tc>
+          <w:tcPr>
+            <w:tcW w:type="dxa" w:w="1080"/>
+          </w:tcPr>
+          <w:p>
+            <w:r>
+              <w:rPr>
+                <w:sz w:val="18"/>
+              </w:rPr>
+              <w:t>1,034,400</w:t>
+            </w:r>
+          </w:p>
+        </w:tc>
+        <w:tc>
+          <w:tcPr>
+            <w:tcW w:type="dxa" w:w="1080"/>
+          </w:tcPr>
+          <w:p>
+            <w:r>
+              <w:rPr>
+                <w:sz w:val="18"/>
+              </w:rPr>
+              <w:t>1,172,880</w:t>
+            </w:r>
+          </w:p>
+        </w:tc>
+        <w:tc>
+          <w:tcPr>
+            <w:tcW w:type="dxa" w:w="1080"/>
+          </w:tcPr>
+          <w:p>
+            <w:r>
+              <w:rPr>
+                <w:sz w:val="18"/>
+              </w:rPr>
+              <w:t>138,480</w:t>
             </w:r>
           </w:p>
         </w:tc>
@@ -6116,7 +6116,7 @@
               <w:rPr>
                 <w:sz w:val="18"/>
               </w:rPr>
-              <w:t>160 VU</w:t>
+              <w:t>80 VU</w:t>
             </w:r>
           </w:p>
         </w:tc>
@@ -6142,72 +6142,72 @@
               <w:rPr>
                 <w:sz w:val="18"/>
               </w:rPr>
-              <w:t>1,094,419</w:t>
-            </w:r>
-          </w:p>
-        </w:tc>
-        <w:tc>
-          <w:tcPr>
-            <w:tcW w:type="dxa" w:w="1080"/>
-          </w:tcPr>
-          <w:p>
-            <w:r>
-              <w:rPr>
-                <w:sz w:val="18"/>
-              </w:rPr>
-              <w:t>24,871</w:t>
-            </w:r>
-          </w:p>
-        </w:tc>
-        <w:tc>
-          <w:tcPr>
-            <w:tcW w:type="dxa" w:w="1080"/>
-          </w:tcPr>
-          <w:p>
-            <w:r>
-              <w:rPr>
-                <w:sz w:val="18"/>
-              </w:rPr>
-              <w:t>2.3%</w:t>
-            </w:r>
-          </w:p>
-        </w:tc>
-        <w:tc>
-          <w:tcPr>
-            <w:tcW w:type="dxa" w:w="1080"/>
-          </w:tcPr>
-          <w:p>
-            <w:r>
-              <w:rPr>
-                <w:sz w:val="18"/>
-              </w:rPr>
-              <w:t>1,051,800</w:t>
-            </w:r>
-          </w:p>
-        </w:tc>
-        <w:tc>
-          <w:tcPr>
-            <w:tcW w:type="dxa" w:w="1080"/>
-          </w:tcPr>
-          <w:p>
-            <w:r>
-              <w:rPr>
-                <w:sz w:val="18"/>
-              </w:rPr>
-              <w:t>1,115,880</w:t>
-            </w:r>
-          </w:p>
-        </w:tc>
-        <w:tc>
-          <w:tcPr>
-            <w:tcW w:type="dxa" w:w="1080"/>
-          </w:tcPr>
-          <w:p>
-            <w:r>
-              <w:rPr>
-                <w:sz w:val="18"/>
-              </w:rPr>
-              <w:t>64,080</w:t>
+              <w:t>1,024,983</w:t>
+            </w:r>
+          </w:p>
+        </w:tc>
+        <w:tc>
+          <w:tcPr>
+            <w:tcW w:type="dxa" w:w="1080"/>
+          </w:tcPr>
+          <w:p>
+            <w:r>
+              <w:rPr>
+                <w:sz w:val="18"/>
+              </w:rPr>
+              <w:t>37,813</w:t>
+            </w:r>
+          </w:p>
+        </w:tc>
+        <w:tc>
+          <w:tcPr>
+            <w:tcW w:type="dxa" w:w="1080"/>
+          </w:tcPr>
+          <w:p>
+            <w:r>
+              <w:rPr>
+                <w:sz w:val="18"/>
+              </w:rPr>
+              <w:t>3.7%</w:t>
+            </w:r>
+          </w:p>
+        </w:tc>
+        <w:tc>
+          <w:tcPr>
+            <w:tcW w:type="dxa" w:w="1080"/>
+          </w:tcPr>
+          <w:p>
+            <w:r>
+              <w:rPr>
+                <w:sz w:val="18"/>
+              </w:rPr>
+              <w:t>953,580</w:t>
+            </w:r>
+          </w:p>
+        </w:tc>
+        <w:tc>
+          <w:tcPr>
+            <w:tcW w:type="dxa" w:w="1080"/>
+          </w:tcPr>
+          <w:p>
+            <w:r>
+              <w:rPr>
+                <w:sz w:val="18"/>
+              </w:rPr>
+              <w:t>1,055,160</w:t>
+            </w:r>
+          </w:p>
+        </w:tc>
+        <w:tc>
+          <w:tcPr>
+            <w:tcW w:type="dxa" w:w="1080"/>
+          </w:tcPr>
+          <w:p>
+            <w:r>
+              <w:rPr>
+                <w:sz w:val="18"/>
+              </w:rPr>
+              <w:t>101,580</w:t>
             </w:r>
           </w:p>
         </w:tc>
@@ -6222,6 +6222,112 @@
               <w:rPr>
                 <w:sz w:val="18"/>
               </w:rPr>
+              <w:t>80 VU</w:t>
+            </w:r>
+          </w:p>
+        </w:tc>
+        <w:tc>
+          <w:tcPr>
+            <w:tcW w:type="dxa" w:w="1080"/>
+          </w:tcPr>
+          <w:p>
+            <w:r>
+              <w:rPr>
+                <w:sz w:val="18"/>
+              </w:rPr>
+              <w:t>MySQL 9.7.0</w:t>
+            </w:r>
+          </w:p>
+        </w:tc>
+        <w:tc>
+          <w:tcPr>
+            <w:tcW w:type="dxa" w:w="1080"/>
+          </w:tcPr>
+          <w:p>
+            <w:r>
+              <w:rPr>
+                <w:sz w:val="18"/>
+              </w:rPr>
+              <w:t>1,165,157</w:t>
+            </w:r>
+          </w:p>
+        </w:tc>
+        <w:tc>
+          <w:tcPr>
+            <w:tcW w:type="dxa" w:w="1080"/>
+          </w:tcPr>
+          <w:p>
+            <w:r>
+              <w:rPr>
+                <w:sz w:val="18"/>
+              </w:rPr>
+              <w:t>46,019</w:t>
+            </w:r>
+          </w:p>
+        </w:tc>
+        <w:tc>
+          <w:tcPr>
+            <w:tcW w:type="dxa" w:w="1080"/>
+          </w:tcPr>
+          <w:p>
+            <w:r>
+              <w:rPr>
+                <w:sz w:val="18"/>
+              </w:rPr>
+              <w:t>4.0%</w:t>
+            </w:r>
+          </w:p>
+        </w:tc>
+        <w:tc>
+          <w:tcPr>
+            <w:tcW w:type="dxa" w:w="1080"/>
+          </w:tcPr>
+          <w:p>
+            <w:r>
+              <w:rPr>
+                <w:sz w:val="18"/>
+              </w:rPr>
+              <w:t>1,082,400</w:t>
+            </w:r>
+          </w:p>
+        </w:tc>
+        <w:tc>
+          <w:tcPr>
+            <w:tcW w:type="dxa" w:w="1080"/>
+          </w:tcPr>
+          <w:p>
+            <w:r>
+              <w:rPr>
+                <w:sz w:val="18"/>
+              </w:rPr>
+              <w:t>1,208,280</w:t>
+            </w:r>
+          </w:p>
+        </w:tc>
+        <w:tc>
+          <w:tcPr>
+            <w:tcW w:type="dxa" w:w="1080"/>
+          </w:tcPr>
+          <w:p>
+            <w:r>
+              <w:rPr>
+                <w:sz w:val="18"/>
+              </w:rPr>
+              <w:t>125,880</w:t>
+            </w:r>
+          </w:p>
+        </w:tc>
+      </w:tr>
+      <w:tr>
+        <w:tc>
+          <w:tcPr>
+            <w:tcW w:type="dxa" w:w="1080"/>
+          </w:tcPr>
+          <w:p>
+            <w:r>
+              <w:rPr>
+                <w:sz w:val="18"/>
+              </w:rPr>
               <w:t>160 VU</w:t>
             </w:r>
           </w:p>
@@ -6235,6 +6341,324 @@
               <w:rPr>
                 <w:sz w:val="18"/>
               </w:rPr>
+              <w:t>MariaDB 12.2.2</w:t>
+            </w:r>
+          </w:p>
+        </w:tc>
+        <w:tc>
+          <w:tcPr>
+            <w:tcW w:type="dxa" w:w="1080"/>
+          </w:tcPr>
+          <w:p>
+            <w:r>
+              <w:rPr>
+                <w:sz w:val="18"/>
+              </w:rPr>
+              <w:t>1,228,908</w:t>
+            </w:r>
+          </w:p>
+        </w:tc>
+        <w:tc>
+          <w:tcPr>
+            <w:tcW w:type="dxa" w:w="1080"/>
+          </w:tcPr>
+          <w:p>
+            <w:r>
+              <w:rPr>
+                <w:sz w:val="18"/>
+              </w:rPr>
+              <w:t>25,099</w:t>
+            </w:r>
+          </w:p>
+        </w:tc>
+        <w:tc>
+          <w:tcPr>
+            <w:tcW w:type="dxa" w:w="1080"/>
+          </w:tcPr>
+          <w:p>
+            <w:r>
+              <w:rPr>
+                <w:sz w:val="18"/>
+              </w:rPr>
+              <w:t>2.0%</w:t>
+            </w:r>
+          </w:p>
+        </w:tc>
+        <w:tc>
+          <w:tcPr>
+            <w:tcW w:type="dxa" w:w="1080"/>
+          </w:tcPr>
+          <w:p>
+            <w:r>
+              <w:rPr>
+                <w:sz w:val="18"/>
+              </w:rPr>
+              <w:t>1,203,780</w:t>
+            </w:r>
+          </w:p>
+        </w:tc>
+        <w:tc>
+          <w:tcPr>
+            <w:tcW w:type="dxa" w:w="1080"/>
+          </w:tcPr>
+          <w:p>
+            <w:r>
+              <w:rPr>
+                <w:sz w:val="18"/>
+              </w:rPr>
+              <w:t>1,248,780</w:t>
+            </w:r>
+          </w:p>
+        </w:tc>
+        <w:tc>
+          <w:tcPr>
+            <w:tcW w:type="dxa" w:w="1080"/>
+          </w:tcPr>
+          <w:p>
+            <w:r>
+              <w:rPr>
+                <w:sz w:val="18"/>
+              </w:rPr>
+              <w:t>45,000</w:t>
+            </w:r>
+          </w:p>
+        </w:tc>
+      </w:tr>
+      <w:tr>
+        <w:tc>
+          <w:tcPr>
+            <w:tcW w:type="dxa" w:w="1080"/>
+          </w:tcPr>
+          <w:p>
+            <w:r>
+              <w:rPr>
+                <w:sz w:val="18"/>
+              </w:rPr>
+              <w:t>160 VU</w:t>
+            </w:r>
+          </w:p>
+        </w:tc>
+        <w:tc>
+          <w:tcPr>
+            <w:tcW w:type="dxa" w:w="1080"/>
+          </w:tcPr>
+          <w:p>
+            <w:r>
+              <w:rPr>
+                <w:sz w:val="18"/>
+              </w:rPr>
+              <w:t>MariaDB 12.3.1</w:t>
+            </w:r>
+          </w:p>
+        </w:tc>
+        <w:tc>
+          <w:tcPr>
+            <w:tcW w:type="dxa" w:w="1080"/>
+          </w:tcPr>
+          <w:p>
+            <w:r>
+              <w:rPr>
+                <w:sz w:val="18"/>
+              </w:rPr>
+              <w:t>1,215,432</w:t>
+            </w:r>
+          </w:p>
+        </w:tc>
+        <w:tc>
+          <w:tcPr>
+            <w:tcW w:type="dxa" w:w="1080"/>
+          </w:tcPr>
+          <w:p>
+            <w:r>
+              <w:rPr>
+                <w:sz w:val="18"/>
+              </w:rPr>
+              <w:t>29,388</w:t>
+            </w:r>
+          </w:p>
+        </w:tc>
+        <w:tc>
+          <w:tcPr>
+            <w:tcW w:type="dxa" w:w="1080"/>
+          </w:tcPr>
+          <w:p>
+            <w:r>
+              <w:rPr>
+                <w:sz w:val="18"/>
+              </w:rPr>
+              <w:t>2.4%</w:t>
+            </w:r>
+          </w:p>
+        </w:tc>
+        <w:tc>
+          <w:tcPr>
+            <w:tcW w:type="dxa" w:w="1080"/>
+          </w:tcPr>
+          <w:p>
+            <w:r>
+              <w:rPr>
+                <w:sz w:val="18"/>
+              </w:rPr>
+              <w:t>1,170,540</w:t>
+            </w:r>
+          </w:p>
+        </w:tc>
+        <w:tc>
+          <w:tcPr>
+            <w:tcW w:type="dxa" w:w="1080"/>
+          </w:tcPr>
+          <w:p>
+            <w:r>
+              <w:rPr>
+                <w:sz w:val="18"/>
+              </w:rPr>
+              <w:t>1,238,100</w:t>
+            </w:r>
+          </w:p>
+        </w:tc>
+        <w:tc>
+          <w:tcPr>
+            <w:tcW w:type="dxa" w:w="1080"/>
+          </w:tcPr>
+          <w:p>
+            <w:r>
+              <w:rPr>
+                <w:sz w:val="18"/>
+              </w:rPr>
+              <w:t>67,560</w:t>
+            </w:r>
+          </w:p>
+        </w:tc>
+      </w:tr>
+      <w:tr>
+        <w:tc>
+          <w:tcPr>
+            <w:tcW w:type="dxa" w:w="1080"/>
+          </w:tcPr>
+          <w:p>
+            <w:r>
+              <w:rPr>
+                <w:sz w:val="18"/>
+              </w:rPr>
+              <w:t>160 VU</w:t>
+            </w:r>
+          </w:p>
+        </w:tc>
+        <w:tc>
+          <w:tcPr>
+            <w:tcW w:type="dxa" w:w="1080"/>
+          </w:tcPr>
+          <w:p>
+            <w:r>
+              <w:rPr>
+                <w:sz w:val="18"/>
+              </w:rPr>
+              <w:t>MySQL 8.4.8</w:t>
+            </w:r>
+          </w:p>
+        </w:tc>
+        <w:tc>
+          <w:tcPr>
+            <w:tcW w:type="dxa" w:w="1080"/>
+          </w:tcPr>
+          <w:p>
+            <w:r>
+              <w:rPr>
+                <w:sz w:val="18"/>
+              </w:rPr>
+              <w:t>1,094,419</w:t>
+            </w:r>
+          </w:p>
+        </w:tc>
+        <w:tc>
+          <w:tcPr>
+            <w:tcW w:type="dxa" w:w="1080"/>
+          </w:tcPr>
+          <w:p>
+            <w:r>
+              <w:rPr>
+                <w:sz w:val="18"/>
+              </w:rPr>
+              <w:t>24,871</w:t>
+            </w:r>
+          </w:p>
+        </w:tc>
+        <w:tc>
+          <w:tcPr>
+            <w:tcW w:type="dxa" w:w="1080"/>
+          </w:tcPr>
+          <w:p>
+            <w:r>
+              <w:rPr>
+                <w:sz w:val="18"/>
+              </w:rPr>
+              <w:t>2.3%</w:t>
+            </w:r>
+          </w:p>
+        </w:tc>
+        <w:tc>
+          <w:tcPr>
+            <w:tcW w:type="dxa" w:w="1080"/>
+          </w:tcPr>
+          <w:p>
+            <w:r>
+              <w:rPr>
+                <w:sz w:val="18"/>
+              </w:rPr>
+              <w:t>1,051,800</w:t>
+            </w:r>
+          </w:p>
+        </w:tc>
+        <w:tc>
+          <w:tcPr>
+            <w:tcW w:type="dxa" w:w="1080"/>
+          </w:tcPr>
+          <w:p>
+            <w:r>
+              <w:rPr>
+                <w:sz w:val="18"/>
+              </w:rPr>
+              <w:t>1,115,880</w:t>
+            </w:r>
+          </w:p>
+        </w:tc>
+        <w:tc>
+          <w:tcPr>
+            <w:tcW w:type="dxa" w:w="1080"/>
+          </w:tcPr>
+          <w:p>
+            <w:r>
+              <w:rPr>
+                <w:sz w:val="18"/>
+              </w:rPr>
+              <w:t>64,080</w:t>
+            </w:r>
+          </w:p>
+        </w:tc>
+      </w:tr>
+      <w:tr>
+        <w:tc>
+          <w:tcPr>
+            <w:tcW w:type="dxa" w:w="1080"/>
+          </w:tcPr>
+          <w:p>
+            <w:r>
+              <w:rPr>
+                <w:sz w:val="18"/>
+              </w:rPr>
+              <w:t>160 VU</w:t>
+            </w:r>
+          </w:p>
+        </w:tc>
+        <w:tc>
+          <w:tcPr>
+            <w:tcW w:type="dxa" w:w="1080"/>
+          </w:tcPr>
+          <w:p>
+            <w:r>
+              <w:rPr>
+                <w:sz w:val="18"/>
+              </w:rPr>
               <w:t>MySQL 9.7.0</w:t>
             </w:r>
           </w:p>
@@ -6314,6 +6738,112 @@
                 <w:sz w:val="18"/>
               </w:rPr>
               <w:t>89,760</w:t>
+            </w:r>
+          </w:p>
+        </w:tc>
+      </w:tr>
+      <w:tr>
+        <w:tc>
+          <w:tcPr>
+            <w:tcW w:type="dxa" w:w="1080"/>
+          </w:tcPr>
+          <w:p>
+            <w:r>
+              <w:rPr>
+                <w:sz w:val="18"/>
+              </w:rPr>
+              <w:t>320 VU</w:t>
+            </w:r>
+          </w:p>
+        </w:tc>
+        <w:tc>
+          <w:tcPr>
+            <w:tcW w:type="dxa" w:w="1080"/>
+          </w:tcPr>
+          <w:p>
+            <w:r>
+              <w:rPr>
+                <w:sz w:val="18"/>
+              </w:rPr>
+              <w:t>MariaDB 12.2.2</w:t>
+            </w:r>
+          </w:p>
+        </w:tc>
+        <w:tc>
+          <w:tcPr>
+            <w:tcW w:type="dxa" w:w="1080"/>
+          </w:tcPr>
+          <w:p>
+            <w:r>
+              <w:rPr>
+                <w:sz w:val="18"/>
+              </w:rPr>
+              <w:t>1,194,182</w:t>
+            </w:r>
+          </w:p>
+        </w:tc>
+        <w:tc>
+          <w:tcPr>
+            <w:tcW w:type="dxa" w:w="1080"/>
+          </w:tcPr>
+          <w:p>
+            <w:r>
+              <w:rPr>
+                <w:sz w:val="18"/>
+              </w:rPr>
+              <w:t>16,935</w:t>
+            </w:r>
+          </w:p>
+        </w:tc>
+        <w:tc>
+          <w:tcPr>
+            <w:tcW w:type="dxa" w:w="1080"/>
+          </w:tcPr>
+          <w:p>
+            <w:r>
+              <w:rPr>
+                <w:sz w:val="18"/>
+              </w:rPr>
+              <w:t>1.4%</w:t>
+            </w:r>
+          </w:p>
+        </w:tc>
+        <w:tc>
+          <w:tcPr>
+            <w:tcW w:type="dxa" w:w="1080"/>
+          </w:tcPr>
+          <w:p>
+            <w:r>
+              <w:rPr>
+                <w:sz w:val="18"/>
+              </w:rPr>
+              <w:t>1,168,680</w:t>
+            </w:r>
+          </w:p>
+        </w:tc>
+        <w:tc>
+          <w:tcPr>
+            <w:tcW w:type="dxa" w:w="1080"/>
+          </w:tcPr>
+          <w:p>
+            <w:r>
+              <w:rPr>
+                <w:sz w:val="18"/>
+              </w:rPr>
+              <w:t>1,216,980</w:t>
+            </w:r>
+          </w:p>
+        </w:tc>
+        <w:tc>
+          <w:tcPr>
+            <w:tcW w:type="dxa" w:w="1080"/>
+          </w:tcPr>
+          <w:p>
+            <w:r>
+              <w:rPr>
+                <w:sz w:val="18"/>
+              </w:rPr>
+              <w:t>48,300</w:t>
             </w:r>
           </w:p>
         </w:tc>

</xml_diff>